<commit_message>
docs: audit architecture.md against src/, and bring the README to submission state
Six places described something the code does not do: section 5 listed five
guardrails where run_all builds six; the action_taken vocabulary named a
stage='validation' no row has carried and missed generation's unknown; the
Layers section omitted what src/api.py now serves; the metrics endpoint needs
--metrics-port; the D-07 bullet listed four never-auto-respond intents where
the code holds five; and D-04, D-05b and PR-EVAL-JUDGE-01 were still listed as
pending. Adds the D-14 decision row and the block-versus-escalate rule.

README: status to week 3, the harness named as the gate command, dated output
directory, API step renumbered. logging_store and metrics comments name the
stages rows actually carry. Stage 5 log updated.

Co-Authored-By: Claude Opus 5 <noreply@anthropic.com>
</commit_message>
<xml_diff>
--- a/workbooks/Stage_5_PRD_Revision_Log.docx
+++ b/workbooks/Stage_5_PRD_Revision_Log.docx
@@ -3368,6 +3368,58 @@
           </w:p>
         </w:tc>
       </w:tr>
+      <w:tr>
+        <w:tc>
+          <w:tcPr>
+            <w:tcW w:type="dxa" w:w="1930"/>
+          </w:tcPr>
+          <w:p>
+            <w:r>
+              <w:t>FR-10 / FR-19 — what a confidence-floor failure routes to</w:t>
+            </w:r>
+          </w:p>
+        </w:tc>
+        <w:tc>
+          <w:tcPr>
+            <w:tcW w:type="dxa" w:w="1930"/>
+          </w:tcPr>
+          <w:p>
+            <w:r>
+              <w:t>v1 (2026-08-29), unchanged through v2.4: FR-10 says the router SHALL escalate any ticket where classifier confidence &lt; CONFIDENCE_THRESHOLD, or any blocking guardrail did not pass; FR-19's acceptance criterion says the confidence-floor guardrail 'overrides to escalate'. src/route.py returned block for every failing blocking guardrail, the floor included, so rule 6 (the router's own confidence rule) could never fire while the guardrails ran.</w:t>
+            </w:r>
+          </w:p>
+        </w:tc>
+        <w:tc>
+          <w:tcPr>
+            <w:tcW w:type="dxa" w:w="1930"/>
+          </w:tcPr>
+          <w:p>
+            <w:r>
+              <w:t>v2.5 (2026-09-20, D-14): the requirement text is unchanged and the code now matches it. route._decide holds the FR-19 floor back from the guardrail-block rule and reads it at rule 6, so a floor failure returns escalate with trigger low_confidence, and _build_bundle no longer flags the draft as blocked when nothing examined it. The five guardrails that read the draft still return block. FR-16's acceptance criterion ('the ticket routes to escalate' for a PII block) still describes that as an escalation; that wording predates the three-outcome router and is left standing as the known gap.</w:t>
+            </w:r>
+          </w:p>
+        </w:tc>
+        <w:tc>
+          <w:tcPr>
+            <w:tcW w:type="dxa" w:w="1930"/>
+          </w:tcPr>
+          <w:p>
+            <w:r>
+              <w:t>Architecture review on 20 Sep, comparing docs/architecture.md against src/. On b21_openai_gemini_80_d12_20260920, 17 of the 33 blocks had the confidence floor as their only failing check, and 7 of those 17 were D-07 policy tickets rule 3 should have taken — a ticket the classifier was unsure about was being reported in the same bucket as a PII leak. No measured figure moves: scoring is auto_respond against everything else. Verified on local models at b21_local_d14_10_20260920 (VAL-0003 and VAL-0007 move block to escalate; replaying that run's verdicts through the old rule changes those two and no others).</w:t>
+            </w:r>
+          </w:p>
+        </w:tc>
+        <w:tc>
+          <w:tcPr>
+            <w:tcW w:type="dxa" w:w="1930"/>
+          </w:tcPr>
+          <w:p>
+            <w:r>
+              <w:t>Alok Kulkarni</w:t>
+            </w:r>
+          </w:p>
+        </w:tc>
+      </w:tr>
     </w:tbl>
     <w:p>
       <w:pPr>

</xml_diff>